<commit_message>
actualización del README.md y la documentacion.docx
</commit_message>
<xml_diff>
--- a/documentación.docx
+++ b/documentación.docx
@@ -352,6 +352,1342 @@
       <w:r>
         <w:t>resultado = mensaje cantidad CRLF</w:t>
       </w:r>
+    </w:p>
+    <w:p>
+      <w:pPr>
+        <w:jc w:val="center"/>
+        <w:rPr>
+          <w:b/>
+          <w:bCs/>
+          <w:sz w:val="40"/>
+          <w:szCs w:val="40"/>
+        </w:rPr>
+      </w:pPr>
+      <w:r>
+        <w:rPr>
+          <w:b/>
+          <w:bCs/>
+          <w:sz w:val="40"/>
+          <w:szCs w:val="40"/>
+        </w:rPr>
+        <w:lastRenderedPageBreak/>
+        <w:t>Diagramas de secuencia</w:t>
+      </w:r>
+    </w:p>
+    <w:p>
+      <w:pPr>
+        <w:jc w:val="center"/>
+        <w:rPr>
+          <w:b/>
+          <w:bCs/>
+          <w:sz w:val="40"/>
+          <w:szCs w:val="40"/>
+        </w:rPr>
+      </w:pPr>
+      <w:r>
+        <w:rPr>
+          <w:b/>
+          <w:bCs/>
+          <w:sz w:val="40"/>
+          <w:szCs w:val="40"/>
+        </w:rPr>
+        <w:drawing>
+          <wp:inline distT="0" distB="0" distL="0" distR="0" wp14:anchorId="63C52ABB" wp14:editId="6631D085">
+            <wp:extent cx="5400040" cy="4912360"/>
+            <wp:effectExtent l="0" t="0" r="0" b="2540"/>
+            <wp:docPr id="1" name="Imagen 1"/>
+            <wp:cNvGraphicFramePr>
+              <a:graphicFrameLocks xmlns:a="http://schemas.openxmlformats.org/drawingml/2006/main" noChangeAspect="1"/>
+            </wp:cNvGraphicFramePr>
+            <a:graphic xmlns:a="http://schemas.openxmlformats.org/drawingml/2006/main">
+              <a:graphicData uri="http://schemas.openxmlformats.org/drawingml/2006/picture">
+                <pic:pic xmlns:pic="http://schemas.openxmlformats.org/drawingml/2006/picture">
+                  <pic:nvPicPr>
+                    <pic:cNvPr id="1" name=""/>
+                    <pic:cNvPicPr/>
+                  </pic:nvPicPr>
+                  <pic:blipFill>
+                    <a:blip r:embed="rId4"/>
+                    <a:stretch>
+                      <a:fillRect/>
+                    </a:stretch>
+                  </pic:blipFill>
+                  <pic:spPr>
+                    <a:xfrm>
+                      <a:off x="0" y="0"/>
+                      <a:ext cx="5400040" cy="4912360"/>
+                    </a:xfrm>
+                    <a:prstGeom prst="rect">
+                      <a:avLst/>
+                    </a:prstGeom>
+                  </pic:spPr>
+                </pic:pic>
+              </a:graphicData>
+            </a:graphic>
+          </wp:inline>
+        </w:drawing>
+      </w:r>
+    </w:p>
+    <w:p>
+      <w:pPr>
+        <w:jc w:val="center"/>
+        <w:rPr>
+          <w:b/>
+          <w:bCs/>
+          <w:sz w:val="40"/>
+          <w:szCs w:val="40"/>
+        </w:rPr>
+      </w:pPr>
+      <w:r>
+        <w:rPr>
+          <w:b/>
+          <w:bCs/>
+          <w:sz w:val="40"/>
+          <w:szCs w:val="40"/>
+        </w:rPr>
+        <w:lastRenderedPageBreak/>
+        <w:drawing>
+          <wp:inline distT="0" distB="0" distL="0" distR="0" wp14:anchorId="2619DE27" wp14:editId="2A57FEB3">
+            <wp:extent cx="5400040" cy="4872355"/>
+            <wp:effectExtent l="0" t="0" r="0" b="4445"/>
+            <wp:docPr id="2" name="Imagen 2"/>
+            <wp:cNvGraphicFramePr>
+              <a:graphicFrameLocks xmlns:a="http://schemas.openxmlformats.org/drawingml/2006/main" noChangeAspect="1"/>
+            </wp:cNvGraphicFramePr>
+            <a:graphic xmlns:a="http://schemas.openxmlformats.org/drawingml/2006/main">
+              <a:graphicData uri="http://schemas.openxmlformats.org/drawingml/2006/picture">
+                <pic:pic xmlns:pic="http://schemas.openxmlformats.org/drawingml/2006/picture">
+                  <pic:nvPicPr>
+                    <pic:cNvPr id="1" name=""/>
+                    <pic:cNvPicPr/>
+                  </pic:nvPicPr>
+                  <pic:blipFill>
+                    <a:blip r:embed="rId5"/>
+                    <a:stretch>
+                      <a:fillRect/>
+                    </a:stretch>
+                  </pic:blipFill>
+                  <pic:spPr>
+                    <a:xfrm>
+                      <a:off x="0" y="0"/>
+                      <a:ext cx="5400040" cy="4872355"/>
+                    </a:xfrm>
+                    <a:prstGeom prst="rect">
+                      <a:avLst/>
+                    </a:prstGeom>
+                  </pic:spPr>
+                </pic:pic>
+              </a:graphicData>
+            </a:graphic>
+          </wp:inline>
+        </w:drawing>
+      </w:r>
+    </w:p>
+    <w:p>
+      <w:pPr>
+        <w:jc w:val="center"/>
+        <w:rPr>
+          <w:b/>
+          <w:bCs/>
+          <w:sz w:val="40"/>
+          <w:szCs w:val="40"/>
+        </w:rPr>
+      </w:pPr>
+    </w:p>
+    <w:p>
+      <w:r>
+        <w:lastRenderedPageBreak/>
+        <w:drawing>
+          <wp:inline distT="0" distB="0" distL="0" distR="0" wp14:anchorId="15E1F183" wp14:editId="17FADDDF">
+            <wp:extent cx="5306165" cy="4382112"/>
+            <wp:effectExtent l="0" t="0" r="0" b="0"/>
+            <wp:docPr id="3" name="Imagen 3"/>
+            <wp:cNvGraphicFramePr>
+              <a:graphicFrameLocks xmlns:a="http://schemas.openxmlformats.org/drawingml/2006/main" noChangeAspect="1"/>
+            </wp:cNvGraphicFramePr>
+            <a:graphic xmlns:a="http://schemas.openxmlformats.org/drawingml/2006/main">
+              <a:graphicData uri="http://schemas.openxmlformats.org/drawingml/2006/picture">
+                <pic:pic xmlns:pic="http://schemas.openxmlformats.org/drawingml/2006/picture">
+                  <pic:nvPicPr>
+                    <pic:cNvPr id="1" name=""/>
+                    <pic:cNvPicPr/>
+                  </pic:nvPicPr>
+                  <pic:blipFill>
+                    <a:blip r:embed="rId6"/>
+                    <a:stretch>
+                      <a:fillRect/>
+                    </a:stretch>
+                  </pic:blipFill>
+                  <pic:spPr>
+                    <a:xfrm>
+                      <a:off x="0" y="0"/>
+                      <a:ext cx="5306165" cy="4382112"/>
+                    </a:xfrm>
+                    <a:prstGeom prst="rect">
+                      <a:avLst/>
+                    </a:prstGeom>
+                  </pic:spPr>
+                </pic:pic>
+              </a:graphicData>
+            </a:graphic>
+          </wp:inline>
+        </w:drawing>
+      </w:r>
+    </w:p>
+    <w:p>
+      <w:r>
+        <w:lastRenderedPageBreak/>
+        <w:drawing>
+          <wp:inline distT="0" distB="0" distL="0" distR="0" wp14:anchorId="0EEC1CFB" wp14:editId="1320910B">
+            <wp:extent cx="5353797" cy="4848902"/>
+            <wp:effectExtent l="0" t="0" r="0" b="8890"/>
+            <wp:docPr id="4" name="Imagen 4"/>
+            <wp:cNvGraphicFramePr>
+              <a:graphicFrameLocks xmlns:a="http://schemas.openxmlformats.org/drawingml/2006/main" noChangeAspect="1"/>
+            </wp:cNvGraphicFramePr>
+            <a:graphic xmlns:a="http://schemas.openxmlformats.org/drawingml/2006/main">
+              <a:graphicData uri="http://schemas.openxmlformats.org/drawingml/2006/picture">
+                <pic:pic xmlns:pic="http://schemas.openxmlformats.org/drawingml/2006/picture">
+                  <pic:nvPicPr>
+                    <pic:cNvPr id="1" name=""/>
+                    <pic:cNvPicPr/>
+                  </pic:nvPicPr>
+                  <pic:blipFill>
+                    <a:blip r:embed="rId7"/>
+                    <a:stretch>
+                      <a:fillRect/>
+                    </a:stretch>
+                  </pic:blipFill>
+                  <pic:spPr>
+                    <a:xfrm>
+                      <a:off x="0" y="0"/>
+                      <a:ext cx="5353797" cy="4848902"/>
+                    </a:xfrm>
+                    <a:prstGeom prst="rect">
+                      <a:avLst/>
+                    </a:prstGeom>
+                  </pic:spPr>
+                </pic:pic>
+              </a:graphicData>
+            </a:graphic>
+          </wp:inline>
+        </w:drawing>
+      </w:r>
+    </w:p>
+    <w:p>
+      <w:r>
+        <w:lastRenderedPageBreak/>
+        <w:drawing>
+          <wp:inline distT="0" distB="0" distL="0" distR="0" wp14:anchorId="76C296E9" wp14:editId="22244F56">
+            <wp:extent cx="5382376" cy="4725059"/>
+            <wp:effectExtent l="0" t="0" r="8890" b="0"/>
+            <wp:docPr id="5" name="Imagen 5"/>
+            <wp:cNvGraphicFramePr>
+              <a:graphicFrameLocks xmlns:a="http://schemas.openxmlformats.org/drawingml/2006/main" noChangeAspect="1"/>
+            </wp:cNvGraphicFramePr>
+            <a:graphic xmlns:a="http://schemas.openxmlformats.org/drawingml/2006/main">
+              <a:graphicData uri="http://schemas.openxmlformats.org/drawingml/2006/picture">
+                <pic:pic xmlns:pic="http://schemas.openxmlformats.org/drawingml/2006/picture">
+                  <pic:nvPicPr>
+                    <pic:cNvPr id="1" name=""/>
+                    <pic:cNvPicPr/>
+                  </pic:nvPicPr>
+                  <pic:blipFill>
+                    <a:blip r:embed="rId8"/>
+                    <a:stretch>
+                      <a:fillRect/>
+                    </a:stretch>
+                  </pic:blipFill>
+                  <pic:spPr>
+                    <a:xfrm>
+                      <a:off x="0" y="0"/>
+                      <a:ext cx="5382376" cy="4725059"/>
+                    </a:xfrm>
+                    <a:prstGeom prst="rect">
+                      <a:avLst/>
+                    </a:prstGeom>
+                  </pic:spPr>
+                </pic:pic>
+              </a:graphicData>
+            </a:graphic>
+          </wp:inline>
+        </w:drawing>
+      </w:r>
+    </w:p>
+    <w:p>
+      <w:r>
+        <w:lastRenderedPageBreak/>
+        <w:drawing>
+          <wp:inline distT="0" distB="0" distL="0" distR="0" wp14:anchorId="673857CD" wp14:editId="778D36C0">
+            <wp:extent cx="5306165" cy="4467849"/>
+            <wp:effectExtent l="0" t="0" r="0" b="9525"/>
+            <wp:docPr id="6" name="Imagen 6"/>
+            <wp:cNvGraphicFramePr>
+              <a:graphicFrameLocks xmlns:a="http://schemas.openxmlformats.org/drawingml/2006/main" noChangeAspect="1"/>
+            </wp:cNvGraphicFramePr>
+            <a:graphic xmlns:a="http://schemas.openxmlformats.org/drawingml/2006/main">
+              <a:graphicData uri="http://schemas.openxmlformats.org/drawingml/2006/picture">
+                <pic:pic xmlns:pic="http://schemas.openxmlformats.org/drawingml/2006/picture">
+                  <pic:nvPicPr>
+                    <pic:cNvPr id="1" name=""/>
+                    <pic:cNvPicPr/>
+                  </pic:nvPicPr>
+                  <pic:blipFill>
+                    <a:blip r:embed="rId9"/>
+                    <a:stretch>
+                      <a:fillRect/>
+                    </a:stretch>
+                  </pic:blipFill>
+                  <pic:spPr>
+                    <a:xfrm>
+                      <a:off x="0" y="0"/>
+                      <a:ext cx="5306165" cy="4467849"/>
+                    </a:xfrm>
+                    <a:prstGeom prst="rect">
+                      <a:avLst/>
+                    </a:prstGeom>
+                  </pic:spPr>
+                </pic:pic>
+              </a:graphicData>
+            </a:graphic>
+          </wp:inline>
+        </w:drawing>
+      </w:r>
+    </w:p>
+    <w:p>
+      <w:r>
+        <w:lastRenderedPageBreak/>
+        <w:drawing>
+          <wp:inline distT="0" distB="0" distL="0" distR="0" wp14:anchorId="0FF7D041" wp14:editId="0B70D237">
+            <wp:extent cx="5400040" cy="4641850"/>
+            <wp:effectExtent l="0" t="0" r="0" b="6350"/>
+            <wp:docPr id="7" name="Imagen 7"/>
+            <wp:cNvGraphicFramePr>
+              <a:graphicFrameLocks xmlns:a="http://schemas.openxmlformats.org/drawingml/2006/main" noChangeAspect="1"/>
+            </wp:cNvGraphicFramePr>
+            <a:graphic xmlns:a="http://schemas.openxmlformats.org/drawingml/2006/main">
+              <a:graphicData uri="http://schemas.openxmlformats.org/drawingml/2006/picture">
+                <pic:pic xmlns:pic="http://schemas.openxmlformats.org/drawingml/2006/picture">
+                  <pic:nvPicPr>
+                    <pic:cNvPr id="1" name=""/>
+                    <pic:cNvPicPr/>
+                  </pic:nvPicPr>
+                  <pic:blipFill>
+                    <a:blip r:embed="rId10"/>
+                    <a:stretch>
+                      <a:fillRect/>
+                    </a:stretch>
+                  </pic:blipFill>
+                  <pic:spPr>
+                    <a:xfrm>
+                      <a:off x="0" y="0"/>
+                      <a:ext cx="5400040" cy="4641850"/>
+                    </a:xfrm>
+                    <a:prstGeom prst="rect">
+                      <a:avLst/>
+                    </a:prstGeom>
+                  </pic:spPr>
+                </pic:pic>
+              </a:graphicData>
+            </a:graphic>
+          </wp:inline>
+        </w:drawing>
+      </w:r>
+    </w:p>
+    <w:p>
+      <w:r>
+        <w:lastRenderedPageBreak/>
+        <w:drawing>
+          <wp:inline distT="0" distB="0" distL="0" distR="0" wp14:anchorId="7F617250" wp14:editId="586B70EE">
+            <wp:extent cx="5268060" cy="4601217"/>
+            <wp:effectExtent l="0" t="0" r="8890" b="8890"/>
+            <wp:docPr id="8" name="Imagen 8"/>
+            <wp:cNvGraphicFramePr>
+              <a:graphicFrameLocks xmlns:a="http://schemas.openxmlformats.org/drawingml/2006/main" noChangeAspect="1"/>
+            </wp:cNvGraphicFramePr>
+            <a:graphic xmlns:a="http://schemas.openxmlformats.org/drawingml/2006/main">
+              <a:graphicData uri="http://schemas.openxmlformats.org/drawingml/2006/picture">
+                <pic:pic xmlns:pic="http://schemas.openxmlformats.org/drawingml/2006/picture">
+                  <pic:nvPicPr>
+                    <pic:cNvPr id="1" name=""/>
+                    <pic:cNvPicPr/>
+                  </pic:nvPicPr>
+                  <pic:blipFill>
+                    <a:blip r:embed="rId11"/>
+                    <a:stretch>
+                      <a:fillRect/>
+                    </a:stretch>
+                  </pic:blipFill>
+                  <pic:spPr>
+                    <a:xfrm>
+                      <a:off x="0" y="0"/>
+                      <a:ext cx="5268060" cy="4601217"/>
+                    </a:xfrm>
+                    <a:prstGeom prst="rect">
+                      <a:avLst/>
+                    </a:prstGeom>
+                  </pic:spPr>
+                </pic:pic>
+              </a:graphicData>
+            </a:graphic>
+          </wp:inline>
+        </w:drawing>
+      </w:r>
+    </w:p>
+    <w:p>
+      <w:r>
+        <w:lastRenderedPageBreak/>
+        <w:drawing>
+          <wp:inline distT="0" distB="0" distL="0" distR="0" wp14:anchorId="57573064" wp14:editId="5A015F07">
+            <wp:extent cx="5400040" cy="4995545"/>
+            <wp:effectExtent l="0" t="0" r="0" b="0"/>
+            <wp:docPr id="9" name="Imagen 9"/>
+            <wp:cNvGraphicFramePr>
+              <a:graphicFrameLocks xmlns:a="http://schemas.openxmlformats.org/drawingml/2006/main" noChangeAspect="1"/>
+            </wp:cNvGraphicFramePr>
+            <a:graphic xmlns:a="http://schemas.openxmlformats.org/drawingml/2006/main">
+              <a:graphicData uri="http://schemas.openxmlformats.org/drawingml/2006/picture">
+                <pic:pic xmlns:pic="http://schemas.openxmlformats.org/drawingml/2006/picture">
+                  <pic:nvPicPr>
+                    <pic:cNvPr id="1" name=""/>
+                    <pic:cNvPicPr/>
+                  </pic:nvPicPr>
+                  <pic:blipFill>
+                    <a:blip r:embed="rId12"/>
+                    <a:stretch>
+                      <a:fillRect/>
+                    </a:stretch>
+                  </pic:blipFill>
+                  <pic:spPr>
+                    <a:xfrm>
+                      <a:off x="0" y="0"/>
+                      <a:ext cx="5400040" cy="4995545"/>
+                    </a:xfrm>
+                    <a:prstGeom prst="rect">
+                      <a:avLst/>
+                    </a:prstGeom>
+                  </pic:spPr>
+                </pic:pic>
+              </a:graphicData>
+            </a:graphic>
+          </wp:inline>
+        </w:drawing>
+      </w:r>
+    </w:p>
+    <w:p>
+      <w:r>
+        <w:lastRenderedPageBreak/>
+        <w:drawing>
+          <wp:inline distT="0" distB="0" distL="0" distR="0" wp14:anchorId="6DBF1DE6" wp14:editId="51E06A05">
+            <wp:extent cx="5400040" cy="6445250"/>
+            <wp:effectExtent l="0" t="0" r="0" b="0"/>
+            <wp:docPr id="10" name="Imagen 10"/>
+            <wp:cNvGraphicFramePr>
+              <a:graphicFrameLocks xmlns:a="http://schemas.openxmlformats.org/drawingml/2006/main" noChangeAspect="1"/>
+            </wp:cNvGraphicFramePr>
+            <a:graphic xmlns:a="http://schemas.openxmlformats.org/drawingml/2006/main">
+              <a:graphicData uri="http://schemas.openxmlformats.org/drawingml/2006/picture">
+                <pic:pic xmlns:pic="http://schemas.openxmlformats.org/drawingml/2006/picture">
+                  <pic:nvPicPr>
+                    <pic:cNvPr id="1" name=""/>
+                    <pic:cNvPicPr/>
+                  </pic:nvPicPr>
+                  <pic:blipFill>
+                    <a:blip r:embed="rId13"/>
+                    <a:stretch>
+                      <a:fillRect/>
+                    </a:stretch>
+                  </pic:blipFill>
+                  <pic:spPr>
+                    <a:xfrm>
+                      <a:off x="0" y="0"/>
+                      <a:ext cx="5400040" cy="6445250"/>
+                    </a:xfrm>
+                    <a:prstGeom prst="rect">
+                      <a:avLst/>
+                    </a:prstGeom>
+                  </pic:spPr>
+                </pic:pic>
+              </a:graphicData>
+            </a:graphic>
+          </wp:inline>
+        </w:drawing>
+      </w:r>
+    </w:p>
+    <w:p>
+      <w:r>
+        <w:lastRenderedPageBreak/>
+        <w:drawing>
+          <wp:inline distT="0" distB="0" distL="0" distR="0" wp14:anchorId="5C272BA7" wp14:editId="6C0CE808">
+            <wp:extent cx="5400040" cy="6509385"/>
+            <wp:effectExtent l="0" t="0" r="0" b="5715"/>
+            <wp:docPr id="11" name="Imagen 11"/>
+            <wp:cNvGraphicFramePr>
+              <a:graphicFrameLocks xmlns:a="http://schemas.openxmlformats.org/drawingml/2006/main" noChangeAspect="1"/>
+            </wp:cNvGraphicFramePr>
+            <a:graphic xmlns:a="http://schemas.openxmlformats.org/drawingml/2006/main">
+              <a:graphicData uri="http://schemas.openxmlformats.org/drawingml/2006/picture">
+                <pic:pic xmlns:pic="http://schemas.openxmlformats.org/drawingml/2006/picture">
+                  <pic:nvPicPr>
+                    <pic:cNvPr id="1" name=""/>
+                    <pic:cNvPicPr/>
+                  </pic:nvPicPr>
+                  <pic:blipFill>
+                    <a:blip r:embed="rId14"/>
+                    <a:stretch>
+                      <a:fillRect/>
+                    </a:stretch>
+                  </pic:blipFill>
+                  <pic:spPr>
+                    <a:xfrm>
+                      <a:off x="0" y="0"/>
+                      <a:ext cx="5400040" cy="6509385"/>
+                    </a:xfrm>
+                    <a:prstGeom prst="rect">
+                      <a:avLst/>
+                    </a:prstGeom>
+                  </pic:spPr>
+                </pic:pic>
+              </a:graphicData>
+            </a:graphic>
+          </wp:inline>
+        </w:drawing>
+      </w:r>
+    </w:p>
+    <w:p>
+      <w:r>
+        <w:lastRenderedPageBreak/>
+        <w:drawing>
+          <wp:inline distT="0" distB="0" distL="0" distR="0" wp14:anchorId="611D6A84" wp14:editId="37CA56E1">
+            <wp:extent cx="5400040" cy="6633210"/>
+            <wp:effectExtent l="0" t="0" r="0" b="0"/>
+            <wp:docPr id="12" name="Imagen 12"/>
+            <wp:cNvGraphicFramePr>
+              <a:graphicFrameLocks xmlns:a="http://schemas.openxmlformats.org/drawingml/2006/main" noChangeAspect="1"/>
+            </wp:cNvGraphicFramePr>
+            <a:graphic xmlns:a="http://schemas.openxmlformats.org/drawingml/2006/main">
+              <a:graphicData uri="http://schemas.openxmlformats.org/drawingml/2006/picture">
+                <pic:pic xmlns:pic="http://schemas.openxmlformats.org/drawingml/2006/picture">
+                  <pic:nvPicPr>
+                    <pic:cNvPr id="1" name=""/>
+                    <pic:cNvPicPr/>
+                  </pic:nvPicPr>
+                  <pic:blipFill>
+                    <a:blip r:embed="rId15"/>
+                    <a:stretch>
+                      <a:fillRect/>
+                    </a:stretch>
+                  </pic:blipFill>
+                  <pic:spPr>
+                    <a:xfrm>
+                      <a:off x="0" y="0"/>
+                      <a:ext cx="5400040" cy="6633210"/>
+                    </a:xfrm>
+                    <a:prstGeom prst="rect">
+                      <a:avLst/>
+                    </a:prstGeom>
+                  </pic:spPr>
+                </pic:pic>
+              </a:graphicData>
+            </a:graphic>
+          </wp:inline>
+        </w:drawing>
+      </w:r>
+    </w:p>
+    <w:p>
+      <w:r>
+        <w:lastRenderedPageBreak/>
+        <w:drawing>
+          <wp:inline distT="0" distB="0" distL="0" distR="0" wp14:anchorId="5384EE3B" wp14:editId="5094B9D9">
+            <wp:extent cx="5400040" cy="5175250"/>
+            <wp:effectExtent l="0" t="0" r="0" b="6350"/>
+            <wp:docPr id="13" name="Imagen 13"/>
+            <wp:cNvGraphicFramePr>
+              <a:graphicFrameLocks xmlns:a="http://schemas.openxmlformats.org/drawingml/2006/main" noChangeAspect="1"/>
+            </wp:cNvGraphicFramePr>
+            <a:graphic xmlns:a="http://schemas.openxmlformats.org/drawingml/2006/main">
+              <a:graphicData uri="http://schemas.openxmlformats.org/drawingml/2006/picture">
+                <pic:pic xmlns:pic="http://schemas.openxmlformats.org/drawingml/2006/picture">
+                  <pic:nvPicPr>
+                    <pic:cNvPr id="1" name=""/>
+                    <pic:cNvPicPr/>
+                  </pic:nvPicPr>
+                  <pic:blipFill>
+                    <a:blip r:embed="rId16"/>
+                    <a:stretch>
+                      <a:fillRect/>
+                    </a:stretch>
+                  </pic:blipFill>
+                  <pic:spPr>
+                    <a:xfrm>
+                      <a:off x="0" y="0"/>
+                      <a:ext cx="5400040" cy="5175250"/>
+                    </a:xfrm>
+                    <a:prstGeom prst="rect">
+                      <a:avLst/>
+                    </a:prstGeom>
+                  </pic:spPr>
+                </pic:pic>
+              </a:graphicData>
+            </a:graphic>
+          </wp:inline>
+        </w:drawing>
+      </w:r>
+    </w:p>
+    <w:p>
+      <w:r>
+        <w:lastRenderedPageBreak/>
+        <w:drawing>
+          <wp:inline distT="0" distB="0" distL="0" distR="0" wp14:anchorId="28EE762F" wp14:editId="29C44B80">
+            <wp:extent cx="5400040" cy="4253230"/>
+            <wp:effectExtent l="0" t="0" r="0" b="0"/>
+            <wp:docPr id="14" name="Imagen 14"/>
+            <wp:cNvGraphicFramePr>
+              <a:graphicFrameLocks xmlns:a="http://schemas.openxmlformats.org/drawingml/2006/main" noChangeAspect="1"/>
+            </wp:cNvGraphicFramePr>
+            <a:graphic xmlns:a="http://schemas.openxmlformats.org/drawingml/2006/main">
+              <a:graphicData uri="http://schemas.openxmlformats.org/drawingml/2006/picture">
+                <pic:pic xmlns:pic="http://schemas.openxmlformats.org/drawingml/2006/picture">
+                  <pic:nvPicPr>
+                    <pic:cNvPr id="1" name=""/>
+                    <pic:cNvPicPr/>
+                  </pic:nvPicPr>
+                  <pic:blipFill>
+                    <a:blip r:embed="rId17"/>
+                    <a:stretch>
+                      <a:fillRect/>
+                    </a:stretch>
+                  </pic:blipFill>
+                  <pic:spPr>
+                    <a:xfrm>
+                      <a:off x="0" y="0"/>
+                      <a:ext cx="5400040" cy="4253230"/>
+                    </a:xfrm>
+                    <a:prstGeom prst="rect">
+                      <a:avLst/>
+                    </a:prstGeom>
+                  </pic:spPr>
+                </pic:pic>
+              </a:graphicData>
+            </a:graphic>
+          </wp:inline>
+        </w:drawing>
+      </w:r>
+    </w:p>
+    <w:p>
+      <w:r>
+        <w:lastRenderedPageBreak/>
+        <w:drawing>
+          <wp:inline distT="0" distB="0" distL="0" distR="0" wp14:anchorId="7CF91D70" wp14:editId="3331BA02">
+            <wp:extent cx="5400040" cy="5260975"/>
+            <wp:effectExtent l="0" t="0" r="0" b="0"/>
+            <wp:docPr id="15" name="Imagen 15"/>
+            <wp:cNvGraphicFramePr>
+              <a:graphicFrameLocks xmlns:a="http://schemas.openxmlformats.org/drawingml/2006/main" noChangeAspect="1"/>
+            </wp:cNvGraphicFramePr>
+            <a:graphic xmlns:a="http://schemas.openxmlformats.org/drawingml/2006/main">
+              <a:graphicData uri="http://schemas.openxmlformats.org/drawingml/2006/picture">
+                <pic:pic xmlns:pic="http://schemas.openxmlformats.org/drawingml/2006/picture">
+                  <pic:nvPicPr>
+                    <pic:cNvPr id="1" name=""/>
+                    <pic:cNvPicPr/>
+                  </pic:nvPicPr>
+                  <pic:blipFill>
+                    <a:blip r:embed="rId18"/>
+                    <a:stretch>
+                      <a:fillRect/>
+                    </a:stretch>
+                  </pic:blipFill>
+                  <pic:spPr>
+                    <a:xfrm>
+                      <a:off x="0" y="0"/>
+                      <a:ext cx="5400040" cy="5260975"/>
+                    </a:xfrm>
+                    <a:prstGeom prst="rect">
+                      <a:avLst/>
+                    </a:prstGeom>
+                  </pic:spPr>
+                </pic:pic>
+              </a:graphicData>
+            </a:graphic>
+          </wp:inline>
+        </w:drawing>
+      </w:r>
+    </w:p>
+    <w:p>
+      <w:pPr>
+        <w:rPr>
+          <w:u w:val="single"/>
+        </w:rPr>
+      </w:pPr>
+      <w:r>
+        <w:lastRenderedPageBreak/>
+        <w:drawing>
+          <wp:inline distT="0" distB="0" distL="0" distR="0" wp14:anchorId="30041EAA" wp14:editId="5064F152">
+            <wp:extent cx="5400040" cy="5798820"/>
+            <wp:effectExtent l="0" t="0" r="0" b="0"/>
+            <wp:docPr id="16" name="Imagen 16"/>
+            <wp:cNvGraphicFramePr>
+              <a:graphicFrameLocks xmlns:a="http://schemas.openxmlformats.org/drawingml/2006/main" noChangeAspect="1"/>
+            </wp:cNvGraphicFramePr>
+            <a:graphic xmlns:a="http://schemas.openxmlformats.org/drawingml/2006/main">
+              <a:graphicData uri="http://schemas.openxmlformats.org/drawingml/2006/picture">
+                <pic:pic xmlns:pic="http://schemas.openxmlformats.org/drawingml/2006/picture">
+                  <pic:nvPicPr>
+                    <pic:cNvPr id="1" name=""/>
+                    <pic:cNvPicPr/>
+                  </pic:nvPicPr>
+                  <pic:blipFill>
+                    <a:blip r:embed="rId19"/>
+                    <a:stretch>
+                      <a:fillRect/>
+                    </a:stretch>
+                  </pic:blipFill>
+                  <pic:spPr>
+                    <a:xfrm>
+                      <a:off x="0" y="0"/>
+                      <a:ext cx="5400040" cy="5798820"/>
+                    </a:xfrm>
+                    <a:prstGeom prst="rect">
+                      <a:avLst/>
+                    </a:prstGeom>
+                  </pic:spPr>
+                </pic:pic>
+              </a:graphicData>
+            </a:graphic>
+          </wp:inline>
+        </w:drawing>
+      </w:r>
+    </w:p>
+    <w:p>
+      <w:pPr>
+        <w:rPr>
+          <w:u w:val="single"/>
+        </w:rPr>
+      </w:pPr>
+    </w:p>
+    <w:p>
+      <w:pPr>
+        <w:rPr>
+          <w:u w:val="single"/>
+        </w:rPr>
+      </w:pPr>
+    </w:p>
+    <w:p>
+      <w:pPr>
+        <w:rPr>
+          <w:u w:val="single"/>
+        </w:rPr>
+      </w:pPr>
+    </w:p>
+    <w:p>
+      <w:pPr>
+        <w:rPr>
+          <w:u w:val="single"/>
+        </w:rPr>
+      </w:pPr>
+    </w:p>
+    <w:p>
+      <w:pPr>
+        <w:rPr>
+          <w:u w:val="single"/>
+        </w:rPr>
+      </w:pPr>
+    </w:p>
+    <w:p>
+      <w:pPr>
+        <w:rPr>
+          <w:u w:val="single"/>
+        </w:rPr>
+      </w:pPr>
+    </w:p>
+    <w:p>
+      <w:pPr>
+        <w:rPr>
+          <w:u w:val="single"/>
+        </w:rPr>
+      </w:pPr>
+    </w:p>
+    <w:p>
+      <w:pPr>
+        <w:rPr>
+          <w:u w:val="single"/>
+        </w:rPr>
+      </w:pPr>
+    </w:p>
+    <w:p>
+      <w:pPr>
+        <w:rPr>
+          <w:u w:val="single"/>
+        </w:rPr>
+      </w:pPr>
+    </w:p>
+    <w:p>
+      <w:pPr>
+        <w:rPr>
+          <w:u w:val="single"/>
+        </w:rPr>
+      </w:pPr>
+    </w:p>
+    <w:p>
+      <w:pPr>
+        <w:jc w:val="center"/>
+        <w:rPr>
+          <w:b/>
+          <w:bCs/>
+          <w:sz w:val="40"/>
+          <w:szCs w:val="40"/>
+        </w:rPr>
+      </w:pPr>
+      <w:r>
+        <w:rPr>
+          <w:b/>
+          <w:bCs/>
+          <w:sz w:val="40"/>
+          <w:szCs w:val="40"/>
+        </w:rPr>
+        <w:lastRenderedPageBreak/>
+        <w:t xml:space="preserve">Diagrama de estado </w:t>
+      </w:r>
+      <w:r>
+        <w:rPr>
+          <w:b/>
+          <w:bCs/>
+          <w:sz w:val="40"/>
+          <w:szCs w:val="40"/>
+        </w:rPr>
+        <w:t>de servidor</w:t>
+      </w:r>
+    </w:p>
+    <w:p>
+      <w:pPr>
+        <w:rPr>
+          <w:u w:val="single"/>
+        </w:rPr>
+      </w:pPr>
+    </w:p>
+    <w:p>
+      <w:pPr>
+        <w:rPr>
+          <w:u w:val="single"/>
+        </w:rPr>
+      </w:pPr>
+      <w:r>
+        <w:rPr>
+          <w:noProof/>
+        </w:rPr>
+        <w:drawing>
+          <wp:inline distT="0" distB="0" distL="0" distR="0" wp14:anchorId="709EC45A" wp14:editId="793E92E9">
+            <wp:extent cx="5400040" cy="6798945"/>
+            <wp:effectExtent l="0" t="0" r="0" b="1905"/>
+            <wp:docPr id="17" name="Imagen 17"/>
+            <wp:cNvGraphicFramePr>
+              <a:graphicFrameLocks xmlns:a="http://schemas.openxmlformats.org/drawingml/2006/main" noChangeAspect="1"/>
+            </wp:cNvGraphicFramePr>
+            <a:graphic xmlns:a="http://schemas.openxmlformats.org/drawingml/2006/main">
+              <a:graphicData uri="http://schemas.openxmlformats.org/drawingml/2006/picture">
+                <pic:pic xmlns:pic="http://schemas.openxmlformats.org/drawingml/2006/picture">
+                  <pic:nvPicPr>
+                    <pic:cNvPr id="0" name="Picture 1"/>
+                    <pic:cNvPicPr>
+                      <a:picLocks noChangeAspect="1" noChangeArrowheads="1"/>
+                    </pic:cNvPicPr>
+                  </pic:nvPicPr>
+                  <pic:blipFill>
+                    <a:blip r:embed="rId20">
+                      <a:extLst>
+                        <a:ext uri="{28A0092B-C50C-407E-A947-70E740481C1C}">
+                          <a14:useLocalDpi xmlns:a14="http://schemas.microsoft.com/office/drawing/2010/main" val="0"/>
+                        </a:ext>
+                      </a:extLst>
+                    </a:blip>
+                    <a:srcRect/>
+                    <a:stretch>
+                      <a:fillRect/>
+                    </a:stretch>
+                  </pic:blipFill>
+                  <pic:spPr bwMode="auto">
+                    <a:xfrm>
+                      <a:off x="0" y="0"/>
+                      <a:ext cx="5400040" cy="6798945"/>
+                    </a:xfrm>
+                    <a:prstGeom prst="rect">
+                      <a:avLst/>
+                    </a:prstGeom>
+                    <a:noFill/>
+                    <a:ln>
+                      <a:noFill/>
+                    </a:ln>
+                  </pic:spPr>
+                </pic:pic>
+              </a:graphicData>
+            </a:graphic>
+          </wp:inline>
+        </w:drawing>
+      </w:r>
+    </w:p>
+    <w:p>
+      <w:pPr>
+        <w:rPr>
+          <w:u w:val="single"/>
+        </w:rPr>
+      </w:pPr>
+    </w:p>
+    <w:p>
+      <w:pPr>
+        <w:rPr>
+          <w:u w:val="single"/>
+        </w:rPr>
+      </w:pPr>
+    </w:p>
+    <w:p>
+      <w:pPr>
+        <w:rPr>
+          <w:u w:val="single"/>
+        </w:rPr>
+      </w:pPr>
+    </w:p>
+    <w:p>
+      <w:pPr>
+        <w:rPr>
+          <w:u w:val="single"/>
+        </w:rPr>
+      </w:pPr>
+    </w:p>
+    <w:p>
+      <w:pPr>
+        <w:jc w:val="center"/>
+        <w:rPr>
+          <w:b/>
+          <w:bCs/>
+          <w:sz w:val="40"/>
+          <w:szCs w:val="40"/>
+        </w:rPr>
+      </w:pPr>
+      <w:r>
+        <w:rPr>
+          <w:b/>
+          <w:bCs/>
+          <w:sz w:val="40"/>
+          <w:szCs w:val="40"/>
+        </w:rPr>
+        <w:lastRenderedPageBreak/>
+        <w:t xml:space="preserve">Diagrama de estado de </w:t>
+      </w:r>
+      <w:r>
+        <w:rPr>
+          <w:b/>
+          <w:bCs/>
+          <w:sz w:val="40"/>
+          <w:szCs w:val="40"/>
+        </w:rPr>
+        <w:t>usuario</w:t>
+      </w:r>
+    </w:p>
+    <w:p>
+      <w:pPr>
+        <w:rPr>
+          <w:u w:val="single"/>
+        </w:rPr>
+      </w:pPr>
+    </w:p>
+    <w:p>
+      <w:pPr>
+        <w:rPr>
+          <w:u w:val="single"/>
+        </w:rPr>
+      </w:pPr>
+      <w:r>
+        <w:rPr>
+          <w:noProof/>
+        </w:rPr>
+        <w:drawing>
+          <wp:inline distT="0" distB="0" distL="0" distR="0" wp14:anchorId="5DACF2B1" wp14:editId="386E6A80">
+            <wp:extent cx="5400040" cy="7485380"/>
+            <wp:effectExtent l="0" t="0" r="0" b="1270"/>
+            <wp:docPr id="18" name="Imagen 18"/>
+            <wp:cNvGraphicFramePr>
+              <a:graphicFrameLocks xmlns:a="http://schemas.openxmlformats.org/drawingml/2006/main" noChangeAspect="1"/>
+            </wp:cNvGraphicFramePr>
+            <a:graphic xmlns:a="http://schemas.openxmlformats.org/drawingml/2006/main">
+              <a:graphicData uri="http://schemas.openxmlformats.org/drawingml/2006/picture">
+                <pic:pic xmlns:pic="http://schemas.openxmlformats.org/drawingml/2006/picture">
+                  <pic:nvPicPr>
+                    <pic:cNvPr id="0" name="Picture 3"/>
+                    <pic:cNvPicPr>
+                      <a:picLocks noChangeAspect="1" noChangeArrowheads="1"/>
+                    </pic:cNvPicPr>
+                  </pic:nvPicPr>
+                  <pic:blipFill>
+                    <a:blip r:embed="rId21">
+                      <a:extLst>
+                        <a:ext uri="{28A0092B-C50C-407E-A947-70E740481C1C}">
+                          <a14:useLocalDpi xmlns:a14="http://schemas.microsoft.com/office/drawing/2010/main" val="0"/>
+                        </a:ext>
+                      </a:extLst>
+                    </a:blip>
+                    <a:srcRect/>
+                    <a:stretch>
+                      <a:fillRect/>
+                    </a:stretch>
+                  </pic:blipFill>
+                  <pic:spPr bwMode="auto">
+                    <a:xfrm>
+                      <a:off x="0" y="0"/>
+                      <a:ext cx="5400040" cy="7485380"/>
+                    </a:xfrm>
+                    <a:prstGeom prst="rect">
+                      <a:avLst/>
+                    </a:prstGeom>
+                    <a:noFill/>
+                    <a:ln>
+                      <a:noFill/>
+                    </a:ln>
+                  </pic:spPr>
+                </pic:pic>
+              </a:graphicData>
+            </a:graphic>
+          </wp:inline>
+        </w:drawing>
+      </w:r>
+    </w:p>
+    <w:p>
+      <w:pPr>
+        <w:rPr>
+          <w:u w:val="single"/>
+        </w:rPr>
+      </w:pPr>
+    </w:p>
+    <w:p>
+      <w:pPr>
+        <w:jc w:val="center"/>
+        <w:rPr>
+          <w:b/>
+          <w:bCs/>
+          <w:sz w:val="40"/>
+          <w:szCs w:val="40"/>
+        </w:rPr>
+      </w:pPr>
+      <w:r>
+        <w:rPr>
+          <w:b/>
+          <w:bCs/>
+          <w:sz w:val="40"/>
+          <w:szCs w:val="40"/>
+        </w:rPr>
+        <w:lastRenderedPageBreak/>
+        <w:t>Leyenda de los diagramas de estado</w:t>
+      </w:r>
+    </w:p>
+    <w:p>
+      <w:pPr>
+        <w:rPr>
+          <w:u w:val="single"/>
+        </w:rPr>
+      </w:pPr>
+    </w:p>
+    <w:p>
+      <w:pPr>
+        <w:rPr>
+          <w:u w:val="single"/>
+        </w:rPr>
+      </w:pPr>
+      <w:r>
+        <w:rPr>
+          <w:u w:val="single"/>
+        </w:rPr>
+        <w:t>1: [Servidor -&gt; Cliente] Envío de Banner/Logo y solicitud de nombre de usuario.</w:t>
+      </w:r>
+    </w:p>
+    <w:p>
+      <w:pPr>
+        <w:rPr>
+          <w:u w:val="single"/>
+        </w:rPr>
+      </w:pPr>
+    </w:p>
+    <w:p>
+      <w:pPr>
+        <w:rPr>
+          <w:u w:val="single"/>
+        </w:rPr>
+      </w:pPr>
+      <w:r>
+        <w:rPr>
+          <w:u w:val="single"/>
+        </w:rPr>
+        <w:t>2: [Cliente -&gt; Servidor] Envío de cadena de texto con el nombre de usuario.</w:t>
+      </w:r>
+    </w:p>
+    <w:p>
+      <w:pPr>
+        <w:rPr>
+          <w:u w:val="single"/>
+        </w:rPr>
+      </w:pPr>
+    </w:p>
+    <w:p>
+      <w:pPr>
+        <w:rPr>
+          <w:u w:val="single"/>
+        </w:rPr>
+      </w:pPr>
+      <w:r>
+        <w:rPr>
+          <w:u w:val="single"/>
+        </w:rPr>
+        <w:t>3: [Servidor -&gt; Cliente] Solicitud de contraseña ("introduzca su contraseña").</w:t>
+      </w:r>
+    </w:p>
+    <w:p>
+      <w:pPr>
+        <w:rPr>
+          <w:u w:val="single"/>
+        </w:rPr>
+      </w:pPr>
+    </w:p>
+    <w:p>
+      <w:pPr>
+        <w:rPr>
+          <w:u w:val="single"/>
+        </w:rPr>
+      </w:pPr>
+      <w:r>
+        <w:rPr>
+          <w:u w:val="single"/>
+        </w:rPr>
+        <w:t>4: [Cliente -&gt; Servidor] Envío de cadena de texto con la contraseña.</w:t>
+      </w:r>
+    </w:p>
+    <w:p>
+      <w:pPr>
+        <w:rPr>
+          <w:u w:val="single"/>
+        </w:rPr>
+      </w:pPr>
+    </w:p>
+    <w:p>
+      <w:pPr>
+        <w:rPr>
+          <w:u w:val="single"/>
+        </w:rPr>
+      </w:pPr>
+      <w:r>
+        <w:rPr>
+          <w:u w:val="single"/>
+        </w:rPr>
+        <w:t>5: [Servidor -&gt; Cliente] Envío de menú de opciones y solicitud de lote de acciones.</w:t>
+      </w:r>
+    </w:p>
+    <w:p>
+      <w:pPr>
+        <w:rPr>
+          <w:u w:val="single"/>
+        </w:rPr>
+      </w:pPr>
+    </w:p>
+    <w:p>
+      <w:pPr>
+        <w:rPr>
+          <w:u w:val="single"/>
+        </w:rPr>
+      </w:pPr>
+      <w:r>
+        <w:rPr>
+          <w:u w:val="single"/>
+        </w:rPr>
+        <w:t>6: [Cliente -&gt; Servidor] Envío de comandos del lote (</w:t>
+      </w:r>
+      <w:proofErr w:type="spellStart"/>
+      <w:r>
+        <w:rPr>
+          <w:u w:val="single"/>
+        </w:rPr>
+        <w:t>ej</w:t>
+      </w:r>
+      <w:proofErr w:type="spellEnd"/>
+      <w:r>
+        <w:rPr>
+          <w:u w:val="single"/>
+        </w:rPr>
+        <w:t>: "1, 2 100").</w:t>
+      </w:r>
+    </w:p>
+    <w:p>
+      <w:pPr>
+        <w:rPr>
+          <w:u w:val="single"/>
+        </w:rPr>
+      </w:pPr>
+    </w:p>
+    <w:p>
+      <w:pPr>
+        <w:rPr>
+          <w:u w:val="single"/>
+        </w:rPr>
+      </w:pPr>
+      <w:r>
+        <w:rPr>
+          <w:u w:val="single"/>
+        </w:rPr>
+        <w:t>7: [Servidor -&gt; Cliente] Solicitud de confirmación final (</w:t>
+      </w:r>
+      <w:proofErr w:type="gramStart"/>
+      <w:r>
+        <w:rPr>
+          <w:u w:val="single"/>
+        </w:rPr>
+        <w:t>"confirmar?</w:t>
+      </w:r>
+      <w:proofErr w:type="gramEnd"/>
+      <w:r>
+        <w:rPr>
+          <w:u w:val="single"/>
+        </w:rPr>
+        <w:t xml:space="preserve"> si/no").</w:t>
+      </w:r>
+    </w:p>
+    <w:p>
+      <w:pPr>
+        <w:rPr>
+          <w:u w:val="single"/>
+        </w:rPr>
+      </w:pPr>
+    </w:p>
+    <w:p>
+      <w:pPr>
+        <w:rPr>
+          <w:u w:val="single"/>
+        </w:rPr>
+      </w:pPr>
+      <w:r>
+        <w:rPr>
+          <w:u w:val="single"/>
+        </w:rPr>
+        <w:t>8: [Cliente -&gt; Servidor] Envío de respuesta de confirmación ("si", "s", "no", "n").</w:t>
+      </w:r>
+    </w:p>
+    <w:p>
+      <w:pPr>
+        <w:rPr>
+          <w:u w:val="single"/>
+        </w:rPr>
+      </w:pPr>
+    </w:p>
+    <w:p>
+      <w:pPr>
+        <w:rPr>
+          <w:u w:val="single"/>
+        </w:rPr>
+      </w:pPr>
+      <w:r>
+        <w:rPr>
+          <w:u w:val="single"/>
+        </w:rPr>
+        <w:t>9: [Servidor -&gt; Cliente] Envío de resultados de las operaciones y saldo final actualizado.</w:t>
+      </w:r>
+    </w:p>
+    <w:p>
+      <w:pPr>
+        <w:rPr>
+          <w:u w:val="single"/>
+        </w:rPr>
+      </w:pPr>
+    </w:p>
+    <w:p>
+      <w:pPr>
+        <w:rPr>
+          <w:u w:val="single"/>
+        </w:rPr>
+      </w:pPr>
+      <w:r>
+        <w:rPr>
+          <w:u w:val="single"/>
+        </w:rPr>
+        <w:t>10: [Cliente -&gt; Servidor] Envío de comando de finalización de sesión (opción "4").</w:t>
+      </w:r>
+    </w:p>
+    <w:p>
+      <w:pPr>
+        <w:rPr>
+          <w:u w:val="single"/>
+        </w:rPr>
+      </w:pPr>
+    </w:p>
+    <w:p>
+      <w:pPr>
+        <w:rPr>
+          <w:u w:val="single"/>
+        </w:rPr>
+      </w:pPr>
+      <w:r>
+        <w:rPr>
+          <w:u w:val="single"/>
+        </w:rPr>
+        <w:t>11: [Servidor -&gt; Cliente] Envío de mensaje de despedida ("¡Hasta pronto!") y cierre.</w:t>
+      </w:r>
+    </w:p>
+    <w:p>
+      <w:pPr>
+        <w:rPr>
+          <w:u w:val="single"/>
+        </w:rPr>
+      </w:pPr>
+    </w:p>
+    <w:p>
+      <w:pPr>
+        <w:rPr>
+          <w:u w:val="single"/>
+        </w:rPr>
+      </w:pPr>
+      <w:r>
+        <w:rPr>
+          <w:u w:val="single"/>
+        </w:rPr>
+        <w:t>12: [Servidor -&gt; Cliente] Envío de mensaje de error (usuario inexistente o credenciales incorrectas).</w:t>
+      </w:r>
+    </w:p>
+    <w:p>
+      <w:pPr>
+        <w:rPr>
+          <w:u w:val="single"/>
+        </w:rPr>
+      </w:pPr>
+    </w:p>
+    <w:p>
+      <w:pPr>
+        <w:rPr>
+          <w:u w:val="single"/>
+        </w:rPr>
+      </w:pPr>
+    </w:p>
+    <w:p>
+      <w:pPr>
+        <w:rPr>
+          <w:u w:val="single"/>
+        </w:rPr>
+      </w:pPr>
+    </w:p>
+    <w:p>
+      <w:pPr>
+        <w:rPr>
+          <w:u w:val="single"/>
+        </w:rPr>
+      </w:pPr>
+    </w:p>
+    <w:p>
+      <w:pPr>
+        <w:rPr>
+          <w:u w:val="single"/>
+        </w:rPr>
+      </w:pPr>
+    </w:p>
+    <w:p>
+      <w:pPr>
+        <w:rPr>
+          <w:u w:val="single"/>
+        </w:rPr>
+      </w:pPr>
     </w:p>
     <w:sectPr>
       <w:pgSz w:w="11906" w:h="16838"/>

</xml_diff>